<commit_message>
Update the internal brief and 動態表 v2_7 with the 24 Sep status
</commit_message>
<xml_diff>
--- a/reports/acdr2026_staff_deployment/ACDR2026_所内打合せ資料_最新状況と要判断事項_0924.docx
+++ b/reports/acdr2026_staff_deployment/ACDR2026_所内打合せ資料_最新状況と要判断事項_0924.docx
@@ -27,7 +27,7 @@
           <w:color w:val="595959"/>
           <w:sz w:val="21"/>
         </w:rPr>
-        <w:t>最新状況と要判断事項（2026年9月24日 08:30 JST 時点）</w:t>
+        <w:t>最新状況と要判断事項（2026年9月24日 14:00 JST 時点・更新版）</w:t>
       </w:r>
     </w:p>
     <w:p>
@@ -41,7 +41,7 @@
           <w:color w:val="595959"/>
           <w:sz w:val="17"/>
         </w:rPr>
-        <w:t>作成: 荒木田　出典: メール、WhatsApp（Coordination Team）、9/18 週次会議（Plaud）、COSEM 提供資料</w:t>
+        <w:t>作成: 荒木田　出典: メール（9/24 午前着信分まで）、WhatsApp（Coordination Team）、9/18 週次会議（Plaud）、COSEM 提供資料</w:t>
       </w:r>
     </w:p>
     <w:p>
@@ -68,7 +68,7 @@
           <w:i w:val="0"/>
           <w:sz w:val="19"/>
         </w:rPr>
-        <w:t>会場（Peridot 201-203）と機材の枠組みは固まった。残る大物は3つ。(1) テクニカルセッションの文書一式が池田の返信待ちのまま止まっており、池田は9/27に出発する。(2) ウズベキスタン枠は無反応・代替なし・ビザ要の三重苦で、10/2締切に間に合わせるなら今週中に代替を立てる判断が要る。(3) Day 1 前倒しの可否と座席の考え方は所内で決めれば即答できる。AV 費用は見積待ちだが、ADRC が負担し得る上限を先に決めておきたい。</w:t>
+        <w:t>9/24 午前で三つ動いた。(1) テクニカルセッションの文書一式は池田と合意した（質疑15分＋まとめ10分、招待状 v2 に追加コメントなし、コンセプトノート rev 1.2）。残るのはシンガポール側の署名者だけで、署名後は池田が各登壇者へ発送する。(2) 会場は U 字28席案と機材リストを Sylvia 氏へ送付済み。名札・マイクの範囲、バナーの修正依頼も WhatsApp で回答済み。(3) タジキスタン・ウズベキスタンへ WhatsApp で再リマインドした。残る大物は、ウズベキスタン枠の代替判断、AV 費用の上限、Day 1 前倒し（日本パビリオンの所要時間次第）、内閣府枠（9/25）の4つ。</w:t>
       </w:r>
     </w:p>
     <w:p>
@@ -214,7 +214,7 @@
                 <w:b w:val="0"/>
                 <w:sz w:val="17"/>
               </w:rPr>
-              <w:t>内閣府（CaO）登壇枠の依頼、SJ60 レセプションの GOH/長官の扱い</w:t>
+              <w:t>CaO 登壇枠の依頼、日本パビリオン開会式の所要時間（Day 1 前倒しの前提）、SJ60 レセプションの GOH/長官の扱い</w:t>
             </w:r>
           </w:p>
         </w:tc>
@@ -271,6 +271,62 @@
                 <w:sz w:val="17"/>
               </w:rPr>
               <w:t>対象: インド3（Official なら不要）、パキスタン2</w:t>
+            </w:r>
+          </w:p>
+        </w:tc>
+      </w:tr>
+      <w:tr>
+        <w:tc>
+          <w:tcPr>
+            <w:tcW w:type="dxa" w:w="1701"/>
+          </w:tcPr>
+          <w:p>
+            <w:pPr>
+              <w:spacing w:after="0" w:line="240" w:lineRule="auto"/>
+            </w:pPr>
+            <w:r/>
+            <w:r>
+              <w:rPr>
+                <w:b w:val="0"/>
+                <w:sz w:val="17"/>
+              </w:rPr>
+              <w:t>9/25（金）午前</w:t>
+            </w:r>
+          </w:p>
+        </w:tc>
+        <w:tc>
+          <w:tcPr>
+            <w:tcW w:type="dxa" w:w="4082"/>
+          </w:tcPr>
+          <w:p>
+            <w:pPr>
+              <w:spacing w:after="0" w:line="240" w:lineRule="auto"/>
+            </w:pPr>
+            <w:r/>
+            <w:r>
+              <w:rPr>
+                <w:b w:val="0"/>
+                <w:sz w:val="17"/>
+              </w:rPr>
+              <w:t>SC 用 ADRC 活動報告案の確認締切</w:t>
+            </w:r>
+          </w:p>
+        </w:tc>
+        <w:tc>
+          <w:tcPr>
+            <w:tcW w:type="dxa" w:w="4082"/>
+          </w:tcPr>
+          <w:p>
+            <w:pPr>
+              <w:spacing w:after="0" w:line="240" w:lineRule="auto"/>
+            </w:pPr>
+            <w:r/>
+            <w:r>
+              <w:rPr>
+                <w:b w:val="0"/>
+                <w:sz w:val="17"/>
+              </w:rPr>
+              <w:t>池田・Mizan・荒木田・Gerry・中村・立部の修正は反映済み。児玉が取りまとめ中</w:t>
             </w:r>
           </w:p>
         </w:tc>
@@ -382,7 +438,63 @@
                 <w:b w:val="0"/>
                 <w:sz w:val="17"/>
               </w:rPr>
-              <w:t>招待状・コンセプトノート・質疑時間の3件を出発前に決める必要</w:t>
+              <w:t>招待状・CN は確認済み。出発前に残るのは SG 側署名者の確認のみ</w:t>
+            </w:r>
+          </w:p>
+        </w:tc>
+      </w:tr>
+      <w:tr>
+        <w:tc>
+          <w:tcPr>
+            <w:tcW w:type="dxa" w:w="1701"/>
+          </w:tcPr>
+          <w:p>
+            <w:pPr>
+              <w:spacing w:after="0" w:line="240" w:lineRule="auto"/>
+            </w:pPr>
+            <w:r/>
+            <w:r>
+              <w:rPr>
+                <w:b w:val="0"/>
+                <w:sz w:val="17"/>
+              </w:rPr>
+              <w:t>9/27 頃</w:t>
+            </w:r>
+          </w:p>
+        </w:tc>
+        <w:tc>
+          <w:tcPr>
+            <w:tcW w:type="dxa" w:w="4082"/>
+          </w:tcPr>
+          <w:p>
+            <w:pPr>
+              <w:spacing w:after="0" w:line="240" w:lineRule="auto"/>
+            </w:pPr>
+            <w:r/>
+            <w:r>
+              <w:rPr>
+                <w:b w:val="0"/>
+                <w:sz w:val="17"/>
+              </w:rPr>
+              <w:t>SJ60 レセプション名簿の提出（1か月前）</w:t>
+            </w:r>
+          </w:p>
+        </w:tc>
+        <w:tc>
+          <w:tcPr>
+            <w:tcW w:type="dxa" w:w="4082"/>
+          </w:tcPr>
+          <w:p>
+            <w:pPr>
+              <w:spacing w:after="0" w:line="240" w:lineRule="auto"/>
+            </w:pPr>
+            <w:r/>
+            <w:r>
+              <w:rPr>
+                <w:b w:val="0"/>
+                <w:sz w:val="17"/>
+              </w:rPr>
+              <w:t>招待状は大使館が全参加者へ</w:t>
             </w:r>
           </w:p>
         </w:tc>
@@ -420,7 +532,7 @@
                 <w:b w:val="0"/>
                 <w:sz w:val="17"/>
               </w:rPr>
-              <w:t>Mizan 出張中（Ho Chi Minh）</w:t>
+              <w:t>Mizan 出張中（Ho Chi Minh → Jakarta）</w:t>
             </w:r>
           </w:p>
         </w:tc>
@@ -606,7 +718,7 @@
                 <w:b w:val="0"/>
                 <w:sz w:val="17"/>
               </w:rPr>
-              <w:t>第7回 10/15 が最終</w:t>
+              <w:t>座席案・AV 見積・Day 1・バナー・07:30 入室・ビザ・名簿。第7回 10/15 が最終</w:t>
             </w:r>
           </w:p>
         </w:tc>
@@ -662,7 +774,7 @@
                 <w:b w:val="0"/>
                 <w:sz w:val="17"/>
               </w:rPr>
-              <w:t>ウズベキスタンは未定のまま</w:t>
+              <w:t>ウズベキスタンは未定のまま。JAXA は人選中</w:t>
             </w:r>
           </w:p>
         </w:tc>
@@ -773,7 +885,6 @@
                 <w:b w:val="0"/>
                 <w:sz w:val="17"/>
               </w:rPr>
-              <w:t>招待状は大使館が全参加者へ。名簿は1か月前（9/27 頃）に提出</w:t>
             </w:r>
           </w:p>
         </w:tc>
@@ -798,7 +909,7 @@
           <w:color w:val="1F3864"/>
           <w:sz w:val="24"/>
         </w:rPr>
-        <w:t>2. 9/17 以降に決まったこと</w:t>
+        <w:t>2. 9/17 以降に決まったこと（9/24 午前の更新を含む）</w:t>
       </w:r>
     </w:p>
     <w:tbl>
@@ -891,7 +1002,7 @@
                 <w:b w:val="0"/>
                 <w:sz w:val="17"/>
               </w:rPr>
-              <w:t>会場</w:t>
+              <w:t>TS 文書一式（新）</w:t>
             </w:r>
           </w:p>
         </w:tc>
@@ -909,7 +1020,7 @@
                 <w:b w:val="0"/>
                 <w:sz w:val="17"/>
               </w:rPr>
-              <w:t>Peridot 201-203 で確定。28日終日＋29日午前。EXPO の縮尺図（動線 2.60m／1.50m／1.30m）を受領。U 中央40席で指名席36（ホスト6・メンバー国28・アドバイザー2）を満たす。EXPO は二重 U（テーブル付き）＋ SEPDM オブザーバー用シアター席の両方を作図中。</w:t>
+              <w:t>質疑15分＋まとめ10分（rev 1.0）を採用。当日の状況で「Q&amp;A とまとめ」の配分は調整可。Sirada 氏へは荒木田から一行訂正。招待状 v2 は池田から追加コメントなし。SG 側署名が済み次第、池田が各登壇者へ発送。コンセプトノートは「Central Asia and Caucasus countries」の表現で rev 1.2（所内版・対外版）。途中版を JAXA・BRIN・YI-Lab へ先に共有してよい。登壇確定者から登録と藤本への連絡を依頼。</w:t>
             </w:r>
           </w:p>
         </w:tc>
@@ -927,7 +1038,287 @@
                 <w:b w:val="0"/>
                 <w:sz w:val="17"/>
               </w:rPr>
-              <w:t>Sylvia 9/18 WhatsApp、9/22 メール</w:t>
+              <w:t>池田 9/24 10:00、荒木田 9/24 10:34</w:t>
+            </w:r>
+          </w:p>
+        </w:tc>
+      </w:tr>
+      <w:tr>
+        <w:tc>
+          <w:tcPr>
+            <w:tcW w:type="dxa" w:w="1361"/>
+          </w:tcPr>
+          <w:p>
+            <w:pPr>
+              <w:spacing w:after="0" w:line="240" w:lineRule="auto"/>
+            </w:pPr>
+            <w:r/>
+            <w:r>
+              <w:rPr>
+                <w:b w:val="0"/>
+                <w:sz w:val="17"/>
+              </w:rPr>
+              <w:t>会場（新）</w:t>
+            </w:r>
+          </w:p>
+        </w:tc>
+        <w:tc>
+          <w:tcPr>
+            <w:tcW w:type="dxa" w:w="6236"/>
+          </w:tcPr>
+          <w:p>
+            <w:pPr>
+              <w:spacing w:after="0" w:line="240" w:lineRule="auto"/>
+            </w:pPr>
+            <w:r/>
+            <w:r>
+              <w:rPr>
+                <w:b w:val="0"/>
+                <w:sz w:val="17"/>
+              </w:rPr>
+              <w:t>Peridot 201-203 確定（28日終日＋29日午前）。9/24 に Sylvia 氏へ送付: U 字28席（12+4+12、メンバー国22＋ホスト6、全席名札・卓上マイク2席に1本）、両サイド12席×2列（机あり）、教室型8席×4列、後方シアター席。前方エリアのみセッションごとに変更（開会・閉会=演壇、RT/SC=モデレーター卓、TS=共同議長卓＋登壇者卓6）。EXPO に作図を依頼。</w:t>
+            </w:r>
+          </w:p>
+        </w:tc>
+        <w:tc>
+          <w:tcPr>
+            <w:tcW w:type="dxa" w:w="2268"/>
+          </w:tcPr>
+          <w:p>
+            <w:pPr>
+              <w:spacing w:after="0" w:line="240" w:lineRule="auto"/>
+            </w:pPr>
+            <w:r/>
+            <w:r>
+              <w:rPr>
+                <w:b w:val="0"/>
+                <w:sz w:val="17"/>
+              </w:rPr>
+              <w:t>荒木田→Sylvia 9/24 09:43 メール</w:t>
+            </w:r>
+          </w:p>
+        </w:tc>
+      </w:tr>
+      <w:tr>
+        <w:tc>
+          <w:tcPr>
+            <w:tcW w:type="dxa" w:w="1361"/>
+          </w:tcPr>
+          <w:p>
+            <w:pPr>
+              <w:spacing w:after="0" w:line="240" w:lineRule="auto"/>
+            </w:pPr>
+            <w:r/>
+            <w:r>
+              <w:rPr>
+                <w:b w:val="0"/>
+                <w:sz w:val="17"/>
+              </w:rPr>
+              <w:t>名札・マイク（新）</w:t>
+            </w:r>
+          </w:p>
+        </w:tc>
+        <w:tc>
+          <w:tcPr>
+            <w:tcW w:type="dxa" w:w="6236"/>
+          </w:tcPr>
+          <w:p>
+            <w:pPr>
+              <w:spacing w:after="0" w:line="240" w:lineRule="auto"/>
+            </w:pPr>
+            <w:r/>
+            <w:r>
+              <w:rPr>
+                <w:b w:val="0"/>
+                <w:sz w:val="17"/>
+              </w:rPr>
+              <w:t>U 字は全席名札。サイド列・教室型は机あり・卓上マイクなし。名札はリソースパーソン、アドバイザー国、オブザーバー、国際機関（AHA センター等）に付け、その他一般参加者は自由席。シアター席は椅子のみ。卓上マイクは U 字と前方卓のみ。</w:t>
+            </w:r>
+          </w:p>
+        </w:tc>
+        <w:tc>
+          <w:tcPr>
+            <w:tcW w:type="dxa" w:w="2268"/>
+          </w:tcPr>
+          <w:p>
+            <w:pPr>
+              <w:spacing w:after="0" w:line="240" w:lineRule="auto"/>
+            </w:pPr>
+            <w:r/>
+            <w:r>
+              <w:rPr>
+                <w:b w:val="0"/>
+                <w:sz w:val="17"/>
+              </w:rPr>
+              <w:t>WhatsApp 9/24 荒木田→Sylvia</w:t>
+            </w:r>
+          </w:p>
+        </w:tc>
+      </w:tr>
+      <w:tr>
+        <w:tc>
+          <w:tcPr>
+            <w:tcW w:type="dxa" w:w="1361"/>
+          </w:tcPr>
+          <w:p>
+            <w:pPr>
+              <w:spacing w:after="0" w:line="240" w:lineRule="auto"/>
+            </w:pPr>
+            <w:r/>
+            <w:r>
+              <w:rPr>
+                <w:b w:val="0"/>
+                <w:sz w:val="17"/>
+              </w:rPr>
+              <w:t>機材（新）</w:t>
+            </w:r>
+          </w:p>
+        </w:tc>
+        <w:tc>
+          <w:tcPr>
+            <w:tcW w:type="dxa" w:w="6236"/>
+          </w:tcPr>
+          <w:p>
+            <w:pPr>
+              <w:spacing w:after="0" w:line="240" w:lineRule="auto"/>
+            </w:pPr>
+            <w:r/>
+            <w:r>
+              <w:rPr>
+                <w:b w:val="0"/>
+                <w:sz w:val="17"/>
+              </w:rPr>
+              <w:t>卓上マイク約22（U 14＋前方最大8）、スタンド4、ハンド2、演壇マイク、外部カメラ（見積の選択肢）、双方向音声、録画、有線 LAN 1回線、タイマー、ユニバーサルアダプタ5。Wi-Fi は Zoom を有線に逃がせば 10Mbps で可。</w:t>
+            </w:r>
+          </w:p>
+        </w:tc>
+        <w:tc>
+          <w:tcPr>
+            <w:tcW w:type="dxa" w:w="2268"/>
+          </w:tcPr>
+          <w:p>
+            <w:pPr>
+              <w:spacing w:after="0" w:line="240" w:lineRule="auto"/>
+            </w:pPr>
+            <w:r/>
+            <w:r>
+              <w:rPr>
+                <w:b w:val="0"/>
+                <w:sz w:val="17"/>
+              </w:rPr>
+              <w:t>荒木田→Sylvia 9/24 メール</w:t>
+            </w:r>
+          </w:p>
+        </w:tc>
+      </w:tr>
+      <w:tr>
+        <w:tc>
+          <w:tcPr>
+            <w:tcW w:type="dxa" w:w="1361"/>
+          </w:tcPr>
+          <w:p>
+            <w:pPr>
+              <w:spacing w:after="0" w:line="240" w:lineRule="auto"/>
+            </w:pPr>
+            <w:r/>
+            <w:r>
+              <w:rPr>
+                <w:b w:val="0"/>
+                <w:sz w:val="17"/>
+              </w:rPr>
+              <w:t>バナー（新）</w:t>
+            </w:r>
+          </w:p>
+        </w:tc>
+        <w:tc>
+          <w:tcPr>
+            <w:tcW w:type="dxa" w:w="6236"/>
+          </w:tcPr>
+          <w:p>
+            <w:pPr>
+              <w:spacing w:after="0" w:line="240" w:lineRule="auto"/>
+            </w:pPr>
+            <w:r/>
+            <w:r>
+              <w:rPr>
+                <w:b w:val="0"/>
+                <w:sz w:val="17"/>
+              </w:rPr>
+              <w:t>COSEM/SCDF のデザイン案で可。修正依頼2点: 上段のロゴ・国旗の上下中心線を揃え両国旗を同サイズに、正式名称「Asian Conference on Disaster Reduction 2026」を大きく。掲載文言は大会名・会期（28-29 Oct）・会場（Singapore Expo Peridot Room）。物理バナー。寸法は EXPO 照会中。</w:t>
+            </w:r>
+          </w:p>
+        </w:tc>
+        <w:tc>
+          <w:tcPr>
+            <w:tcW w:type="dxa" w:w="2268"/>
+          </w:tcPr>
+          <w:p>
+            <w:pPr>
+              <w:spacing w:after="0" w:line="240" w:lineRule="auto"/>
+            </w:pPr>
+            <w:r/>
+            <w:r>
+              <w:rPr>
+                <w:b w:val="0"/>
+                <w:sz w:val="17"/>
+              </w:rPr>
+              <w:t>WhatsApp 9/24 荒木田→Sylvia</w:t>
+            </w:r>
+          </w:p>
+        </w:tc>
+      </w:tr>
+      <w:tr>
+        <w:tc>
+          <w:tcPr>
+            <w:tcW w:type="dxa" w:w="1361"/>
+          </w:tcPr>
+          <w:p>
+            <w:pPr>
+              <w:spacing w:after="0" w:line="240" w:lineRule="auto"/>
+            </w:pPr>
+            <w:r/>
+            <w:r>
+              <w:rPr>
+                <w:b w:val="0"/>
+                <w:sz w:val="17"/>
+              </w:rPr>
+              <w:t>登録（新）</w:t>
+            </w:r>
+          </w:p>
+        </w:tc>
+        <w:tc>
+          <w:tcPr>
+            <w:tcW w:type="dxa" w:w="6236"/>
+          </w:tcPr>
+          <w:p>
+            <w:pPr>
+              <w:spacing w:after="0" w:line="240" w:lineRule="auto"/>
+            </w:pPr>
+            <w:r/>
+            <w:r>
+              <w:rPr>
+                <w:b w:val="0"/>
+                <w:sz w:val="17"/>
+              </w:rPr>
+              <w:t>ブルネイ1名（Rina Nurhafizah、9/20）、韓国3名（Kim Ingeon・Lee Taekgeon・Song Hana、MOIS、9/21）、COSEM Fabian Tan 氏（9/24）、一般オンライン1名。タイは DDPM が Prasong Thammapala 氏（NDWC 所長）を指名予定、ADRC は1名分負担と回答済み。西川専門員は SIDEX 3日目の登壇者で、Welcome Dinner 招待のためリソース登録（費用は COSEM 持ち）。</w:t>
+            </w:r>
+          </w:p>
+        </w:tc>
+        <w:tc>
+          <w:tcPr>
+            <w:tcW w:type="dxa" w:w="2268"/>
+          </w:tcPr>
+          <w:p>
+            <w:pPr>
+              <w:spacing w:after="0" w:line="240" w:lineRule="auto"/>
+            </w:pPr>
+            <w:r/>
+            <w:r>
+              <w:rPr>
+                <w:b w:val="0"/>
+                <w:sz w:val="17"/>
+              </w:rPr>
+              <w:t>藤本 9/24、吉田 9/22、児玉 9/24</w:t>
             </w:r>
           </w:p>
         </w:tc>
@@ -965,7 +1356,7 @@
                 <w:b w:val="0"/>
                 <w:sz w:val="17"/>
               </w:rPr>
-              <w:t>Peridot 203: 21,000lm 3-chip 2560×1600。201-202: 8,000lm 1920×1200。HDMI 1本で全面ミラー。切替は AV オペレータ。演壇は EXPO 備品だがマイクなし（AV 見積に含める）。クリッカー1本無償。タイマーなし。照明は室内パネル。</w:t>
+              <w:t>Peridot 203: 21,000lm 2560×1600。201-202: 8,000lm 1920×1200。HDMI 1本で全面ミラー。切替は AV オペレータ。演壇にマイクなし。クリッカー1本無償。タイマーなし。</w:t>
             </w:r>
           </w:p>
         </w:tc>
@@ -1021,7 +1412,7 @@
                 <w:b w:val="0"/>
                 <w:sz w:val="17"/>
               </w:rPr>
-              <w:t>無料 Wi-Fi は最大 10Mbps・ランディングページ付き。有線 LAN は EXPO 価格 S$1,000＋GST／回線。COSEM が他業者を探す。Webcam はベンダー有償か持参。</w:t>
+              <w:t>無料 Wi-Fi 10Mbps・ランディングページ付き。有線 LAN は S$1,000＋GST／回線。COSEM が他業者を探す。</w:t>
             </w:r>
           </w:p>
         </w:tc>
@@ -1059,118 +1450,6 @@
                 <w:b w:val="0"/>
                 <w:sz w:val="17"/>
               </w:rPr>
-              <w:t>AV 費用</w:t>
-            </w:r>
-          </w:p>
-        </w:tc>
-        <w:tc>
-          <w:tcPr>
-            <w:tcW w:type="dxa" w:w="6236"/>
-          </w:tcPr>
-          <w:p>
-            <w:pPr>
-              <w:spacing w:after="0" w:line="240" w:lineRule="auto"/>
-            </w:pPr>
-            <w:r/>
-            <w:r>
-              <w:rPr>
-                <w:b w:val="0"/>
-                <w:sz w:val="17"/>
-              </w:rPr>
-              <w:t>負担区分は見積を見てから協議（未定）。マイクは会議用（conference）で安価に。</w:t>
-            </w:r>
-          </w:p>
-        </w:tc>
-        <w:tc>
-          <w:tcPr>
-            <w:tcW w:type="dxa" w:w="2268"/>
-          </w:tcPr>
-          <w:p>
-            <w:pPr>
-              <w:spacing w:after="0" w:line="240" w:lineRule="auto"/>
-            </w:pPr>
-            <w:r/>
-            <w:r>
-              <w:rPr>
-                <w:b w:val="0"/>
-                <w:sz w:val="17"/>
-              </w:rPr>
-              <w:t>Sylvia 9/22</w:t>
-            </w:r>
-          </w:p>
-        </w:tc>
-      </w:tr>
-      <w:tr>
-        <w:tc>
-          <w:tcPr>
-            <w:tcW w:type="dxa" w:w="1361"/>
-          </w:tcPr>
-          <w:p>
-            <w:pPr>
-              <w:spacing w:after="0" w:line="240" w:lineRule="auto"/>
-            </w:pPr>
-            <w:r/>
-            <w:r>
-              <w:rPr>
-                <w:b w:val="0"/>
-                <w:sz w:val="17"/>
-              </w:rPr>
-              <w:t>TS 登壇者</w:t>
-            </w:r>
-          </w:p>
-        </w:tc>
-        <w:tc>
-          <w:tcPr>
-            <w:tcW w:type="dxa" w:w="6236"/>
-          </w:tcPr>
-          <w:p>
-            <w:pPr>
-              <w:spacing w:after="0" w:line="240" w:lineRule="auto"/>
-            </w:pPr>
-            <w:r/>
-            <w:r>
-              <w:rPr>
-                <w:b w:val="0"/>
-                <w:sz w:val="17"/>
-              </w:rPr>
-              <w:t>6人目も他の登壇者と同じ待遇（COSEM・SCDF に 6＋1 で共有済み）。登壇者はフィールドトリップ参加可（空きがあれば。main guest list 優先）。</w:t>
-            </w:r>
-          </w:p>
-        </w:tc>
-        <w:tc>
-          <w:tcPr>
-            <w:tcW w:type="dxa" w:w="2268"/>
-          </w:tcPr>
-          <w:p>
-            <w:pPr>
-              <w:spacing w:after="0" w:line="240" w:lineRule="auto"/>
-            </w:pPr>
-            <w:r/>
-            <w:r>
-              <w:rPr>
-                <w:b w:val="0"/>
-                <w:sz w:val="17"/>
-              </w:rPr>
-              <w:t>Sylvia 9/18</w:t>
-            </w:r>
-          </w:p>
-        </w:tc>
-      </w:tr>
-      <w:tr>
-        <w:tc>
-          <w:tcPr>
-            <w:tcW w:type="dxa" w:w="1361"/>
-          </w:tcPr>
-          <w:p>
-            <w:pPr>
-              <w:spacing w:after="0" w:line="240" w:lineRule="auto"/>
-            </w:pPr>
-            <w:r/>
-            <w:r>
-              <w:rPr>
-                <w:b w:val="0"/>
-                <w:sz w:val="17"/>
-              </w:rPr>
               <w:t>TS モデレーター</w:t>
             </w:r>
           </w:p>
@@ -1189,7 +1468,7 @@
                 <w:b w:val="0"/>
                 <w:sz w:val="17"/>
               </w:rPr>
-              <w:t>Lieutenant Colonel Chen Yong Kai, Deputy Commander, 3rd SCDF Division。予備 LTC Adrian はプログラム・レセプションに含めない。</w:t>
+              <w:t>Lieutenant Colonel Chen Yong Kai, Deputy Commander, 3rd SCDF Division。予備 LTC Adrian はプログラム・レセプションに含めない。6人目も他の登壇者と同待遇。登壇者はフィールドトリップ参加可（空きがあれば）。</w:t>
             </w:r>
           </w:p>
         </w:tc>
@@ -1207,63 +1486,7 @@
                 <w:b w:val="0"/>
                 <w:sz w:val="17"/>
               </w:rPr>
-              <w:t>Sylvia 9/17</w:t>
-            </w:r>
-          </w:p>
-        </w:tc>
-      </w:tr>
-      <w:tr>
-        <w:tc>
-          <w:tcPr>
-            <w:tcW w:type="dxa" w:w="1361"/>
-          </w:tcPr>
-          <w:p>
-            <w:pPr>
-              <w:spacing w:after="0" w:line="240" w:lineRule="auto"/>
-            </w:pPr>
-            <w:r/>
-            <w:r>
-              <w:rPr>
-                <w:b w:val="0"/>
-                <w:sz w:val="17"/>
-              </w:rPr>
-              <w:t>バナー</w:t>
-            </w:r>
-          </w:p>
-        </w:tc>
-        <w:tc>
-          <w:tcPr>
-            <w:tcW w:type="dxa" w:w="6236"/>
-          </w:tcPr>
-          <w:p>
-            <w:pPr>
-              <w:spacing w:after="0" w:line="240" w:lineRule="auto"/>
-            </w:pPr>
-            <w:r/>
-            <w:r>
-              <w:rPr>
-                <w:b w:val="0"/>
-                <w:sz w:val="17"/>
-              </w:rPr>
-              <w:t>投影ではなく物理バナー（スクリーンはビデオ会議で使用）。COSEM のデザイン案3便を 9/18 に藤本へ転送。寸法は EXPO 照会中。</w:t>
-            </w:r>
-          </w:p>
-        </w:tc>
-        <w:tc>
-          <w:tcPr>
-            <w:tcW w:type="dxa" w:w="2268"/>
-          </w:tcPr>
-          <w:p>
-            <w:pPr>
-              <w:spacing w:after="0" w:line="240" w:lineRule="auto"/>
-            </w:pPr>
-            <w:r/>
-            <w:r>
-              <w:rPr>
-                <w:b w:val="0"/>
-                <w:sz w:val="17"/>
-              </w:rPr>
-              <w:t>Sylvia 9/18、荒木田→藤本</w:t>
+              <w:t>Sylvia 9/17・9/18</w:t>
             </w:r>
           </w:p>
         </w:tc>
@@ -1301,7 +1524,7 @@
                 <w:b w:val="0"/>
                 <w:sz w:val="17"/>
               </w:rPr>
-              <w:t>ICA 一次情報で確認: ネパール・インドネシア不要、ウズベキスタン必要（外交旅券のみ免除）。田中: 対象者の旅券写しは受領済み、残存6か月を確認中、Form 14A は本人記入（E チケットから）、ビザ不要登録者には一行連絡。</w:t>
+              <w:t>ICA 一次情報: ネパール・インドネシア不要、ウズベキスタン・タジキスタン要。田中: 旅券写し受領済み、残存6か月確認中、Form 14A は本人記入、ビザ不要登録者には一行連絡。ウズベキスタン登壇者はビザ要と田中へ回答済み。</w:t>
             </w:r>
           </w:p>
         </w:tc>
@@ -1319,7 +1542,7 @@
                 <w:b w:val="0"/>
                 <w:sz w:val="17"/>
               </w:rPr>
-              <w:t>ICA、田中 9/18</w:t>
+              <w:t>ICA、田中 9/18、荒木田 9/24</w:t>
             </w:r>
           </w:p>
         </w:tc>
@@ -1357,7 +1580,7 @@
                 <w:b w:val="0"/>
                 <w:sz w:val="17"/>
               </w:rPr>
-              <w:t>最新版は 13:00 出発・16:15 終了（WhatsApp 配布）。ADRC の Web 用アジェンダ v2 は 13:00-16:15 で整合。COSEM の7月資料（14:00／13:30）のみ古い。</w:t>
+              <w:t>13:00 出発・16:15 終了（WhatsApp 配布の最新版）。ADRC Web 用アジェンダ v2 と整合。</w:t>
             </w:r>
           </w:p>
         </w:tc>
@@ -1395,7 +1618,7 @@
                 <w:b w:val="0"/>
                 <w:sz w:val="17"/>
               </w:rPr>
-              <w:t>レセプション登録</w:t>
+              <w:t>レセプション</w:t>
             </w:r>
           </w:p>
         </w:tc>
@@ -1413,7 +1636,7 @@
                 <w:b w:val="0"/>
                 <w:sz w:val="17"/>
               </w:rPr>
-              <w:t>シンガポール側は Comr＋Alan Chow（登録済）＋LTC Chen、COSEM は Leow 氏・Sylvia 氏ほか。招待状は大使館から全参加者へ発出、個別 formal invite は不要。</w:t>
+              <w:t>シンガポール側は Comr＋Alan Chow＋LTC Chen、COSEM は Leow 氏・Sylvia 氏ほか。招待状は大使館から全参加者へ。</w:t>
             </w:r>
           </w:p>
         </w:tc>
@@ -1431,7 +1654,7 @@
                 <w:b w:val="0"/>
                 <w:sz w:val="17"/>
               </w:rPr>
-              <w:t>WhatsApp 9/17 児玉・田中</w:t>
+              <w:t>WhatsApp 9/17</w:t>
             </w:r>
           </w:p>
         </w:tc>
@@ -1469,7 +1692,7 @@
                 <w:b w:val="0"/>
                 <w:sz w:val="17"/>
               </w:rPr>
-              <w:t>インドネシア: 往路 GA828（27日）で打診、復路は30日夕で照会中（Mizan → BRIN）。ネパール: Air India 経由 vs SQ 直行を藤本がアドミと相談中。</w:t>
+              <w:t>インドネシア（Yenni Vetrita 氏）: GA828（27日）で打診、復路は30日夕で照会中。ネパール（Pradip Khatiwada 氏）: Air India 経由か SQ 直行かをアドミと相談中。見積取得中と池田へ連絡済み。</w:t>
             </w:r>
           </w:p>
         </w:tc>
@@ -1487,7 +1710,7 @@
                 <w:b w:val="0"/>
                 <w:sz w:val="17"/>
               </w:rPr>
-              <w:t>藤本 9/18</w:t>
+              <w:t>藤本 9/18、荒木田 9/24</w:t>
             </w:r>
           </w:p>
         </w:tc>
@@ -1525,7 +1748,7 @@
                 <w:b w:val="0"/>
                 <w:sz w:val="17"/>
               </w:rPr>
-              <w:t>インド: 最終承認・旅券待ちで発券保留。NZ 3人目はメンバー国と同扱い。タイ: 1名分負担で回答。ADB の請求は Sylvia 氏が処理済み。ED の食事制限なし。</w:t>
+              <w:t>インド: 最終承認・旅券待ちで発券保留。NZ 3人目はメンバー国と同扱い。ADB 請求は Sylvia 氏が処理済み。ED の食事制限なし。</w:t>
             </w:r>
           </w:p>
         </w:tc>
@@ -1721,7 +1944,7 @@
                 <w:b w:val="0"/>
                 <w:sz w:val="17"/>
               </w:rPr>
-              <w:t>U 字席の考え方</w:t>
+              <w:t>Day 1 の前倒し（Sylvia 氏要望）</w:t>
             </w:r>
           </w:p>
         </w:tc>
@@ -1739,7 +1962,7 @@
                 <w:b w:val="0"/>
                 <w:sz w:val="17"/>
               </w:rPr>
-              <w:t>児玉: 内側は各国1名、随行は後列。荒木田: 2名まで着席を想定していた。U 中央40席に対し指名席36。2名着席なら 28×2＋8＝64 で物理的に入らない。</w:t>
+              <w:t>RT・SC は短縮不可と回答済み。前倒しの可否は日本パビリオン開会式（GOH ツアー内、現行5分）の所要時間次第。田中から正式回答の依頼（9/18）が未対応。</w:t>
             </w:r>
           </w:p>
         </w:tc>
@@ -1757,7 +1980,7 @@
                 <w:b w:val="0"/>
                 <w:sz w:val="17"/>
               </w:rPr>
-              <w:t>内側1名（国名プレート）、2人目は二重 U の2列目。空き4席は ADPC・観察者に。</w:t>
+              <w:t>9/25 連絡会で内閣府の希望時間を確認し、前倒しできる場合は昼食を 11:45-12:30 に短縮、開会 12:30・RT 12:45-15:15・SC 15:30-16:30 として田中経由で回答。10/1 合同会議で確定。</w:t>
             </w:r>
           </w:p>
         </w:tc>
@@ -1775,7 +1998,7 @@
                 <w:b w:val="0"/>
                 <w:sz w:val="17"/>
               </w:rPr>
-              <w:t>児玉・荒木田</w:t>
+              <w:t>荒木田 → 田中</w:t>
             </w:r>
           </w:p>
         </w:tc>
@@ -1813,7 +2036,7 @@
                 <w:b w:val="0"/>
                 <w:sz w:val="17"/>
               </w:rPr>
-              <w:t>Day 1 の前倒し（Sylvia 氏要望）</w:t>
+              <w:t>ウズベキスタン枠</w:t>
             </w:r>
           </w:p>
         </w:tc>
@@ -1831,7 +2054,7 @@
                 <w:b w:val="0"/>
                 <w:sz w:val="17"/>
               </w:rPr>
-              <w:t>ガラディナー前にホテルに戻る時間を作りたい。現行: 昼食 11:45-12:45、開会 12:45、RT 13:00-15:30、休憩、SC 15:45-16:45、Dorsett 17:30 発。RT・SC は短縮不可と WhatsApp で回答済み。田中から正式回答の依頼（9/18）。</w:t>
+              <w:t>9/16 の個人アドレスへの再照会に無反応。9/24 に WhatsApp で再リマインド（タジキスタンと併せて）。代替候補なし。ビザ要（申請 9/26〜、3営業日）。10/2 締切。</w:t>
             </w:r>
           </w:p>
         </w:tc>
@@ -1849,7 +2072,7 @@
                 <w:b w:val="0"/>
                 <w:sz w:val="17"/>
               </w:rPr>
-              <w:t>昼食を 11:45-12:30 に、開会 12:30、RT 12:45-15:15、SC 15:30-16:30 で 1 時間確保。昼食は COSEM 側なので合同会議（10/1）で提案。</w:t>
+              <w:t>今週中に回答がなければ代替（中央アジア他国の JICA 研修修了生、または ADRC 内部）へ切替。CN の「Central Asia and Caucasus」は代替でも使える。</w:t>
             </w:r>
           </w:p>
         </w:tc>
@@ -1867,7 +2090,7 @@
                 <w:b w:val="0"/>
                 <w:sz w:val="17"/>
               </w:rPr>
-              <w:t>荒木田 → 田中</w:t>
+              <w:t>荒木田</w:t>
             </w:r>
           </w:p>
         </w:tc>
@@ -1888,282 +2111,6 @@
                 <w:sz w:val="17"/>
               </w:rPr>
               <w:t>C</w:t>
-            </w:r>
-          </w:p>
-        </w:tc>
-        <w:tc>
-          <w:tcPr>
-            <w:tcW w:type="dxa" w:w="1474"/>
-          </w:tcPr>
-          <w:p>
-            <w:pPr>
-              <w:spacing w:after="0" w:line="240" w:lineRule="auto"/>
-            </w:pPr>
-            <w:r/>
-            <w:r>
-              <w:rPr>
-                <w:b w:val="0"/>
-                <w:sz w:val="17"/>
-              </w:rPr>
-              <w:t>TS 質疑の長さ</w:t>
-            </w:r>
-          </w:p>
-        </w:tc>
-        <w:tc>
-          <w:tcPr>
-            <w:tcW w:type="dxa" w:w="3515"/>
-          </w:tcPr>
-          <w:p>
-            <w:pPr>
-              <w:spacing w:after="0" w:line="240" w:lineRule="auto"/>
-            </w:pPr>
-            <w:r/>
-            <w:r>
-              <w:rPr>
-                <w:b w:val="0"/>
-                <w:sz w:val="17"/>
-              </w:rPr>
-              <w:t>池田 rev 1.0 は質疑15分＋まとめ10分。Sirada 氏へは 9/9 に「約30分の質疑」と書面で伝達済み。</w:t>
-            </w:r>
-          </w:p>
-        </w:tc>
-        <w:tc>
-          <w:tcPr>
-            <w:tcW w:type="dxa" w:w="3061"/>
-          </w:tcPr>
-          <w:p>
-            <w:pPr>
-              <w:spacing w:after="0" w:line="240" w:lineRule="auto"/>
-            </w:pPr>
-            <w:r/>
-            <w:r>
-              <w:rPr>
-                <w:b w:val="0"/>
-                <w:sz w:val="17"/>
-              </w:rPr>
-              <w:t>rev 1.0 を採用し、Sirada 氏へ次の連絡で一行訂正。</w:t>
-            </w:r>
-          </w:p>
-        </w:tc>
-        <w:tc>
-          <w:tcPr>
-            <w:tcW w:type="dxa" w:w="1134"/>
-          </w:tcPr>
-          <w:p>
-            <w:pPr>
-              <w:spacing w:after="0" w:line="240" w:lineRule="auto"/>
-            </w:pPr>
-            <w:r/>
-            <w:r>
-              <w:rPr>
-                <w:b w:val="0"/>
-                <w:sz w:val="17"/>
-              </w:rPr>
-              <w:t>池田 判断</w:t>
-            </w:r>
-          </w:p>
-        </w:tc>
-      </w:tr>
-      <w:tr>
-        <w:tc>
-          <w:tcPr>
-            <w:tcW w:type="dxa" w:w="454"/>
-          </w:tcPr>
-          <w:p>
-            <w:pPr>
-              <w:spacing w:after="0" w:line="240" w:lineRule="auto"/>
-            </w:pPr>
-            <w:r/>
-            <w:r>
-              <w:rPr>
-                <w:b w:val="0"/>
-                <w:sz w:val="17"/>
-              </w:rPr>
-              <w:t>D</w:t>
-            </w:r>
-          </w:p>
-        </w:tc>
-        <w:tc>
-          <w:tcPr>
-            <w:tcW w:type="dxa" w:w="1474"/>
-          </w:tcPr>
-          <w:p>
-            <w:pPr>
-              <w:spacing w:after="0" w:line="240" w:lineRule="auto"/>
-            </w:pPr>
-            <w:r/>
-            <w:r>
-              <w:rPr>
-                <w:b w:val="0"/>
-                <w:sz w:val="17"/>
-              </w:rPr>
-              <w:t>招待状（リソース）</w:t>
-            </w:r>
-          </w:p>
-        </w:tc>
-        <w:tc>
-          <w:tcPr>
-            <w:tcW w:type="dxa" w:w="3515"/>
-          </w:tcPr>
-          <w:p>
-            <w:pPr>
-              <w:spacing w:after="0" w:line="240" w:lineRule="auto"/>
-            </w:pPr>
-            <w:r/>
-            <w:r>
-              <w:rPr>
-                <w:b w:val="0"/>
-                <w:sz w:val="17"/>
-              </w:rPr>
-              <w:t>池田案＋荒木田案の統合版 v2 あり（署名は ADRC・SG 双方）。池田の返信なし。SG 側署名者未確認。費用条項は登壇者ごと（ウズベク＝ADRC 負担、Google・JAXA＝自己負担、BRIN・YI-Lab・内閣府＝要確認）。</w:t>
-            </w:r>
-          </w:p>
-        </w:tc>
-        <w:tc>
-          <w:tcPr>
-            <w:tcW w:type="dxa" w:w="3061"/>
-          </w:tcPr>
-          <w:p>
-            <w:pPr>
-              <w:spacing w:after="0" w:line="240" w:lineRule="auto"/>
-            </w:pPr>
-            <w:r/>
-            <w:r>
-              <w:rPr>
-                <w:b w:val="0"/>
-                <w:sz w:val="17"/>
-              </w:rPr>
-              <w:t>池田出発前に v2 で確定し、SG 署名者を Sylvia 氏に照会。</w:t>
-            </w:r>
-          </w:p>
-        </w:tc>
-        <w:tc>
-          <w:tcPr>
-            <w:tcW w:type="dxa" w:w="1134"/>
-          </w:tcPr>
-          <w:p>
-            <w:pPr>
-              <w:spacing w:after="0" w:line="240" w:lineRule="auto"/>
-            </w:pPr>
-            <w:r/>
-            <w:r>
-              <w:rPr>
-                <w:b w:val="0"/>
-                <w:sz w:val="17"/>
-              </w:rPr>
-              <w:t>池田・荒木田</w:t>
-            </w:r>
-          </w:p>
-        </w:tc>
-      </w:tr>
-      <w:tr>
-        <w:tc>
-          <w:tcPr>
-            <w:tcW w:type="dxa" w:w="454"/>
-          </w:tcPr>
-          <w:p>
-            <w:pPr>
-              <w:spacing w:after="0" w:line="240" w:lineRule="auto"/>
-            </w:pPr>
-            <w:r/>
-            <w:r>
-              <w:rPr>
-                <w:b w:val="0"/>
-                <w:sz w:val="17"/>
-              </w:rPr>
-              <w:t>E</w:t>
-            </w:r>
-          </w:p>
-        </w:tc>
-        <w:tc>
-          <w:tcPr>
-            <w:tcW w:type="dxa" w:w="1474"/>
-          </w:tcPr>
-          <w:p>
-            <w:pPr>
-              <w:spacing w:after="0" w:line="240" w:lineRule="auto"/>
-            </w:pPr>
-            <w:r/>
-            <w:r>
-              <w:rPr>
-                <w:b w:val="0"/>
-                <w:sz w:val="17"/>
-              </w:rPr>
-              <w:t>コンセプトノート</w:t>
-            </w:r>
-          </w:p>
-        </w:tc>
-        <w:tc>
-          <w:tcPr>
-            <w:tcW w:type="dxa" w:w="3515"/>
-          </w:tcPr>
-          <w:p>
-            <w:pPr>
-              <w:spacing w:after="0" w:line="240" w:lineRule="auto"/>
-            </w:pPr>
-            <w:r/>
-            <w:r>
-              <w:rPr>
-                <w:b w:val="0"/>
-                <w:sz w:val="17"/>
-              </w:rPr>
-              <w:t>池田 rev 1.0（9/16）が最新。追記候補: モデレーター氏名、LLDC 例に中央アジア、群島国の一文、所内版／対外版の分離。Web には組織名のみ掲載の方針（9/18）。</w:t>
-            </w:r>
-          </w:p>
-        </w:tc>
-        <w:tc>
-          <w:tcPr>
-            <w:tcW w:type="dxa" w:w="3061"/>
-          </w:tcPr>
-          <w:p>
-            <w:pPr>
-              <w:spacing w:after="0" w:line="240" w:lineRule="auto"/>
-            </w:pPr>
-            <w:r/>
-            <w:r>
-              <w:rPr>
-                <w:b w:val="0"/>
-                <w:sz w:val="17"/>
-              </w:rPr>
-              <w:t>rev 1.1 を池田が出す。対外版は氏名なし。</w:t>
-            </w:r>
-          </w:p>
-        </w:tc>
-        <w:tc>
-          <w:tcPr>
-            <w:tcW w:type="dxa" w:w="1134"/>
-          </w:tcPr>
-          <w:p>
-            <w:pPr>
-              <w:spacing w:after="0" w:line="240" w:lineRule="auto"/>
-            </w:pPr>
-            <w:r/>
-            <w:r>
-              <w:rPr>
-                <w:b w:val="0"/>
-                <w:sz w:val="17"/>
-              </w:rPr>
-              <w:t>池田</w:t>
-            </w:r>
-          </w:p>
-        </w:tc>
-      </w:tr>
-      <w:tr>
-        <w:tc>
-          <w:tcPr>
-            <w:tcW w:type="dxa" w:w="454"/>
-          </w:tcPr>
-          <w:p>
-            <w:pPr>
-              <w:spacing w:after="0" w:line="240" w:lineRule="auto"/>
-            </w:pPr>
-            <w:r/>
-            <w:r>
-              <w:rPr>
-                <w:b w:val="0"/>
-                <w:sz w:val="17"/>
-              </w:rPr>
-              <w:t>F</w:t>
             </w:r>
           </w:p>
         </w:tc>
@@ -2217,7 +2164,7 @@
                 <w:b w:val="0"/>
                 <w:sz w:val="17"/>
               </w:rPr>
-              <w:t>9/25 の連絡会で正式に依頼。人選・締切（10/2）を伝える。</w:t>
+              <w:t>9/25 の連絡会で正式に依頼。持ち時間15分、締切（10/2・10/20）を伝える。</w:t>
             </w:r>
           </w:p>
         </w:tc>
@@ -2255,99 +2202,7 @@
                 <w:b w:val="0"/>
                 <w:sz w:val="17"/>
               </w:rPr>
-              <w:t>G</w:t>
-            </w:r>
-          </w:p>
-        </w:tc>
-        <w:tc>
-          <w:tcPr>
-            <w:tcW w:type="dxa" w:w="1474"/>
-          </w:tcPr>
-          <w:p>
-            <w:pPr>
-              <w:spacing w:after="0" w:line="240" w:lineRule="auto"/>
-            </w:pPr>
-            <w:r/>
-            <w:r>
-              <w:rPr>
-                <w:b w:val="0"/>
-                <w:sz w:val="17"/>
-              </w:rPr>
-              <w:t>ウズベキスタン枠</w:t>
-            </w:r>
-          </w:p>
-        </w:tc>
-        <w:tc>
-          <w:tcPr>
-            <w:tcW w:type="dxa" w:w="3515"/>
-          </w:tcPr>
-          <w:p>
-            <w:pPr>
-              <w:spacing w:after="0" w:line="240" w:lineRule="auto"/>
-            </w:pPr>
-            <w:r/>
-            <w:r>
-              <w:rPr>
-                <w:b w:val="0"/>
-                <w:sz w:val="17"/>
-              </w:rPr>
-              <w:t>9/16 個人アドレスへ再照会後も無反応。代替候補なし。ビザ要（申請 9/26〜、3営業日）。10/2 締切。</w:t>
-            </w:r>
-          </w:p>
-        </w:tc>
-        <w:tc>
-          <w:tcPr>
-            <w:tcW w:type="dxa" w:w="3061"/>
-          </w:tcPr>
-          <w:p>
-            <w:pPr>
-              <w:spacing w:after="0" w:line="240" w:lineRule="auto"/>
-            </w:pPr>
-            <w:r/>
-            <w:r>
-              <w:rPr>
-                <w:b w:val="0"/>
-                <w:sz w:val="17"/>
-              </w:rPr>
-              <w:t>今週中に回答がなければ代替（中央アジア他国の JICA 研修修了生、または ADRC 内部）へ切替。</w:t>
-            </w:r>
-          </w:p>
-        </w:tc>
-        <w:tc>
-          <w:tcPr>
-            <w:tcW w:type="dxa" w:w="1134"/>
-          </w:tcPr>
-          <w:p>
-            <w:pPr>
-              <w:spacing w:after="0" w:line="240" w:lineRule="auto"/>
-            </w:pPr>
-            <w:r/>
-            <w:r>
-              <w:rPr>
-                <w:b w:val="0"/>
-                <w:sz w:val="17"/>
-              </w:rPr>
-              <w:t>荒木田</w:t>
-            </w:r>
-          </w:p>
-        </w:tc>
-      </w:tr>
-      <w:tr>
-        <w:tc>
-          <w:tcPr>
-            <w:tcW w:type="dxa" w:w="454"/>
-          </w:tcPr>
-          <w:p>
-            <w:pPr>
-              <w:spacing w:after="0" w:line="240" w:lineRule="auto"/>
-            </w:pPr>
-            <w:r/>
-            <w:r>
-              <w:rPr>
-                <w:b w:val="0"/>
-                <w:sz w:val="17"/>
-              </w:rPr>
-              <w:t>H</w:t>
+              <w:t>D</w:t>
             </w:r>
           </w:p>
         </w:tc>
@@ -2383,7 +2238,7 @@
                 <w:b w:val="0"/>
                 <w:sz w:val="17"/>
               </w:rPr>
-              <w:t>2候補から選定中（9/18 週次）。</w:t>
+              <w:t>2候補から選定中（9/18 週次）。自己負担。</w:t>
             </w:r>
           </w:p>
         </w:tc>
@@ -2401,7 +2256,7 @@
                 <w:b w:val="0"/>
                 <w:sz w:val="17"/>
               </w:rPr>
-              <w:t>氏名確定を 10/2 前に。</w:t>
+              <w:t>氏名確定を 10/2 前に。CN 途中版の共有と同時に催促。</w:t>
             </w:r>
           </w:p>
         </w:tc>
@@ -2439,7 +2294,7 @@
                 <w:b w:val="0"/>
                 <w:sz w:val="17"/>
               </w:rPr>
-              <w:t>I</w:t>
+              <w:t>E</w:t>
             </w:r>
           </w:p>
         </w:tc>
@@ -2475,7 +2330,7 @@
                 <w:b w:val="0"/>
                 <w:sz w:val="17"/>
               </w:rPr>
-              <w:t>見積待ち。項目: マイク27＋4＋2、演壇マイク、Webcam、LAN S$1,000＋GST。</w:t>
+              <w:t>見積待ち。9/24 に機材リストを提示済み。</w:t>
             </w:r>
           </w:p>
         </w:tc>
@@ -2531,7 +2386,7 @@
                 <w:b w:val="0"/>
                 <w:sz w:val="17"/>
               </w:rPr>
-              <w:t>J</w:t>
+              <w:t>F</w:t>
             </w:r>
           </w:p>
         </w:tc>
@@ -2549,7 +2404,7 @@
                 <w:b w:val="0"/>
                 <w:sz w:val="17"/>
               </w:rPr>
-              <w:t>バナー文言</w:t>
+              <w:t>招待状の SG 側署名者</w:t>
             </w:r>
           </w:p>
         </w:tc>
@@ -2567,7 +2422,7 @@
                 <w:b w:val="0"/>
                 <w:sz w:val="17"/>
               </w:rPr>
-              <w:t>デザインは COSEM。掲載文言（大会名・テーマ・会期・会場・共催）が未確定。藤本の案回答待ち（9/18〜）。</w:t>
+              <w:t>池田は署名後に発送する前提。SG 側が誰の名で署名するか未確認。</w:t>
             </w:r>
           </w:p>
         </w:tc>
@@ -2585,7 +2440,7 @@
                 <w:b w:val="0"/>
                 <w:sz w:val="17"/>
               </w:rPr>
-              <w:t>文言を今週中に確定し COSEM へ。</w:t>
+              <w:t>Sylvia 氏に照会（次のメールで）。SCDF 幹部か COSEM Leow 氏か。電子署名で可か。</w:t>
             </w:r>
           </w:p>
         </w:tc>
@@ -2603,7 +2458,7 @@
                 <w:b w:val="0"/>
                 <w:sz w:val="17"/>
               </w:rPr>
-              <w:t>藤本</w:t>
+              <w:t>荒木田</w:t>
             </w:r>
           </w:p>
         </w:tc>
@@ -2623,7 +2478,99 @@
                 <w:b w:val="0"/>
                 <w:sz w:val="17"/>
               </w:rPr>
-              <w:t>K</w:t>
+              <w:t>G</w:t>
+            </w:r>
+          </w:p>
+        </w:tc>
+        <w:tc>
+          <w:tcPr>
+            <w:tcW w:type="dxa" w:w="1474"/>
+          </w:tcPr>
+          <w:p>
+            <w:pPr>
+              <w:spacing w:after="0" w:line="240" w:lineRule="auto"/>
+            </w:pPr>
+            <w:r/>
+            <w:r>
+              <w:rPr>
+                <w:b w:val="0"/>
+                <w:sz w:val="17"/>
+              </w:rPr>
+              <w:t>バナーの文言にテーマを入れるか</w:t>
+            </w:r>
+          </w:p>
+        </w:tc>
+        <w:tc>
+          <w:tcPr>
+            <w:tcW w:type="dxa" w:w="3515"/>
+          </w:tcPr>
+          <w:p>
+            <w:pPr>
+              <w:spacing w:after="0" w:line="240" w:lineRule="auto"/>
+            </w:pPr>
+            <w:r/>
+            <w:r>
+              <w:rPr>
+                <w:b w:val="0"/>
+                <w:sz w:val="17"/>
+              </w:rPr>
+              <w:t>COSEM 案は大会名・会期・会場のみ。テーマの記載なし。</w:t>
+            </w:r>
+          </w:p>
+        </w:tc>
+        <w:tc>
+          <w:tcPr>
+            <w:tcW w:type="dxa" w:w="3061"/>
+          </w:tcPr>
+          <w:p>
+            <w:pPr>
+              <w:spacing w:after="0" w:line="240" w:lineRule="auto"/>
+            </w:pPr>
+            <w:r/>
+            <w:r>
+              <w:rPr>
+                <w:b w:val="0"/>
+                <w:sz w:val="17"/>
+              </w:rPr>
+              <w:t>現案のまま（テーマなし）で進める。入れるなら修正依頼と同時に伝える。</w:t>
+            </w:r>
+          </w:p>
+        </w:tc>
+        <w:tc>
+          <w:tcPr>
+            <w:tcW w:type="dxa" w:w="1134"/>
+          </w:tcPr>
+          <w:p>
+            <w:pPr>
+              <w:spacing w:after="0" w:line="240" w:lineRule="auto"/>
+            </w:pPr>
+            <w:r/>
+            <w:r>
+              <w:rPr>
+                <w:b w:val="0"/>
+                <w:sz w:val="17"/>
+              </w:rPr>
+              <w:t>荒木田・藤本</w:t>
+            </w:r>
+          </w:p>
+        </w:tc>
+      </w:tr>
+      <w:tr>
+        <w:tc>
+          <w:tcPr>
+            <w:tcW w:type="dxa" w:w="454"/>
+          </w:tcPr>
+          <w:p>
+            <w:pPr>
+              <w:spacing w:after="0" w:line="240" w:lineRule="auto"/>
+            </w:pPr>
+            <w:r/>
+            <w:r>
+              <w:rPr>
+                <w:b w:val="0"/>
+                <w:sz w:val="17"/>
+              </w:rPr>
+              <w:t>H</w:t>
             </w:r>
           </w:p>
         </w:tc>
@@ -2715,7 +2662,7 @@
                 <w:b w:val="0"/>
                 <w:sz w:val="17"/>
               </w:rPr>
-              <w:t>L</w:t>
+              <w:t>I</w:t>
             </w:r>
           </w:p>
         </w:tc>
@@ -2751,7 +2698,7 @@
                 <w:b w:val="0"/>
                 <w:sz w:val="17"/>
               </w:rPr>
-              <w:t>Nishikawa 氏、Dave Gawn 氏（NZ）、AUS NEMA、Comr が同日同時刻に両方の招待対象。</w:t>
+              <w:t>Nishikawa 氏、Dave Gawn 氏（NZ）、AUS NEMA、Comr が同日同時刻に両方の対象。</w:t>
             </w:r>
           </w:p>
         </w:tc>
@@ -2788,6 +2735,98 @@
                 <w:sz w:val="17"/>
               </w:rPr>
               <w:t>児玉</w:t>
+            </w:r>
+          </w:p>
+        </w:tc>
+      </w:tr>
+      <w:tr>
+        <w:tc>
+          <w:tcPr>
+            <w:tcW w:type="dxa" w:w="454"/>
+          </w:tcPr>
+          <w:p>
+            <w:pPr>
+              <w:spacing w:after="0" w:line="240" w:lineRule="auto"/>
+            </w:pPr>
+            <w:r/>
+            <w:r>
+              <w:rPr>
+                <w:b w:val="0"/>
+                <w:sz w:val="17"/>
+              </w:rPr>
+              <w:t>J</w:t>
+            </w:r>
+          </w:p>
+        </w:tc>
+        <w:tc>
+          <w:tcPr>
+            <w:tcW w:type="dxa" w:w="1474"/>
+          </w:tcPr>
+          <w:p>
+            <w:pPr>
+              <w:spacing w:after="0" w:line="240" w:lineRule="auto"/>
+            </w:pPr>
+            <w:r/>
+            <w:r>
+              <w:rPr>
+                <w:b w:val="0"/>
+                <w:sz w:val="17"/>
+              </w:rPr>
+              <w:t>韓国の人数</w:t>
+            </w:r>
+          </w:p>
+        </w:tc>
+        <w:tc>
+          <w:tcPr>
+            <w:tcW w:type="dxa" w:w="3515"/>
+          </w:tcPr>
+          <w:p>
+            <w:pPr>
+              <w:spacing w:after="0" w:line="240" w:lineRule="auto"/>
+            </w:pPr>
+            <w:r/>
+            <w:r>
+              <w:rPr>
+                <w:b w:val="0"/>
+                <w:sz w:val="17"/>
+              </w:rPr>
+              <w:t>9/21 に3名登録（MOIS）。8/28 リストの So 氏を含めると4名か、差替えか不明。</w:t>
+            </w:r>
+          </w:p>
+        </w:tc>
+        <w:tc>
+          <w:tcPr>
+            <w:tcW w:type="dxa" w:w="3061"/>
+          </w:tcPr>
+          <w:p>
+            <w:pPr>
+              <w:spacing w:after="0" w:line="240" w:lineRule="auto"/>
+            </w:pPr>
+            <w:r/>
+            <w:r>
+              <w:rPr>
+                <w:b w:val="0"/>
+                <w:sz w:val="17"/>
+              </w:rPr>
+              <w:t>名簿で確認し、Dorsett の D/DS 区分を整理。</w:t>
+            </w:r>
+          </w:p>
+        </w:tc>
+        <w:tc>
+          <w:tcPr>
+            <w:tcW w:type="dxa" w:w="1134"/>
+          </w:tcPr>
+          <w:p>
+            <w:pPr>
+              <w:spacing w:after="0" w:line="240" w:lineRule="auto"/>
+            </w:pPr>
+            <w:r/>
+            <w:r>
+              <w:rPr>
+                <w:b w:val="0"/>
+                <w:sz w:val="17"/>
+              </w:rPr>
+              <w:t>田中</w:t>
             </w:r>
           </w:p>
         </w:tc>
@@ -2926,7 +2965,7 @@
                 <w:b w:val="0"/>
                 <w:sz w:val="17"/>
               </w:rPr>
-              <w:t>池田</w:t>
+              <w:t>Sylvia</w:t>
             </w:r>
           </w:p>
         </w:tc>
@@ -2944,7 +2983,7 @@
                 <w:b w:val="0"/>
                 <w:sz w:val="17"/>
               </w:rPr>
-              <w:t>招待状 v2・コンセプトノート追記・質疑時間への回答</w:t>
+              <w:t>U 字28席案の EXPO 作図、AV 見積、バナー修正版・寸法、07:30 入室、フィールドトリップの服装、SG 側署名者</w:t>
             </w:r>
           </w:p>
         </w:tc>
@@ -2962,7 +3001,7 @@
                 <w:b w:val="0"/>
                 <w:sz w:val="17"/>
               </w:rPr>
-              <w:t>9/17「追って返信」から7日</w:t>
+              <w:t>9/24 送付・回答</w:t>
             </w:r>
           </w:p>
         </w:tc>
@@ -2980,7 +3019,7 @@
                 <w:b w:val="0"/>
                 <w:sz w:val="17"/>
               </w:rPr>
-              <w:t>9/25 に直接確認。9/27 出発前に決める</w:t>
+              <w:t>10/1 合同会議前に一度まとめて確認</w:t>
             </w:r>
           </w:p>
         </w:tc>
@@ -3000,7 +3039,7 @@
                 <w:b w:val="0"/>
                 <w:sz w:val="17"/>
               </w:rPr>
-              <w:t>藤本</w:t>
+              <w:t>ウズベキスタン・タジキスタン</w:t>
             </w:r>
           </w:p>
         </w:tc>
@@ -3018,7 +3057,7 @@
                 <w:b w:val="0"/>
                 <w:sz w:val="17"/>
               </w:rPr>
-              <w:t>COSEM のバナー案への意見</w:t>
+              <w:t>登壇者の指名（ウズベク）、参加登録</w:t>
             </w:r>
           </w:p>
         </w:tc>
@@ -3036,7 +3075,7 @@
                 <w:b w:val="0"/>
                 <w:sz w:val="17"/>
               </w:rPr>
-              <w:t>9/18 から6日</w:t>
+              <w:t>9/24 WhatsApp 再リマインド</w:t>
             </w:r>
           </w:p>
         </w:tc>
@@ -3054,155 +3093,7 @@
                 <w:b w:val="0"/>
                 <w:sz w:val="17"/>
               </w:rPr>
-              <w:t>打合せで口頭確認</w:t>
-            </w:r>
-          </w:p>
-        </w:tc>
-      </w:tr>
-      <w:tr>
-        <w:tc>
-          <w:tcPr>
-            <w:tcW w:type="dxa" w:w="1361"/>
-          </w:tcPr>
-          <w:p>
-            <w:pPr>
-              <w:spacing w:after="0" w:line="240" w:lineRule="auto"/>
-            </w:pPr>
-            <w:r/>
-            <w:r>
-              <w:rPr>
-                <w:b w:val="0"/>
-                <w:sz w:val="17"/>
-              </w:rPr>
-              <w:t>Sylvia</w:t>
-            </w:r>
-          </w:p>
-        </w:tc>
-        <w:tc>
-          <w:tcPr>
-            <w:tcW w:type="dxa" w:w="3742"/>
-          </w:tcPr>
-          <w:p>
-            <w:pPr>
-              <w:spacing w:after="0" w:line="240" w:lineRule="auto"/>
-            </w:pPr>
-            <w:r/>
-            <w:r>
-              <w:rPr>
-                <w:b w:val="0"/>
-                <w:sz w:val="17"/>
-              </w:rPr>
-              <w:t>バナー寸法（EXPO 照会中）、SG 側署名者、フィールドトリップの服装要件、07:30 入室、AV 見積</w:t>
-            </w:r>
-          </w:p>
-        </w:tc>
-        <w:tc>
-          <w:tcPr>
-            <w:tcW w:type="dxa" w:w="2041"/>
-          </w:tcPr>
-          <w:p>
-            <w:pPr>
-              <w:spacing w:after="0" w:line="240" w:lineRule="auto"/>
-            </w:pPr>
-            <w:r/>
-            <w:r>
-              <w:rPr>
-                <w:b w:val="0"/>
-                <w:sz w:val="17"/>
-              </w:rPr>
-              <w:t>寸法 9/18〜、服装 9/6〜</w:t>
-            </w:r>
-          </w:p>
-        </w:tc>
-        <w:tc>
-          <w:tcPr>
-            <w:tcW w:type="dxa" w:w="2721"/>
-          </w:tcPr>
-          <w:p>
-            <w:pPr>
-              <w:spacing w:after="0" w:line="240" w:lineRule="auto"/>
-            </w:pPr>
-            <w:r/>
-            <w:r>
-              <w:rPr>
-                <w:b w:val="0"/>
-                <w:sz w:val="17"/>
-              </w:rPr>
-              <w:t>会場メール（下書き）送信後にまとめて</w:t>
-            </w:r>
-          </w:p>
-        </w:tc>
-      </w:tr>
-      <w:tr>
-        <w:tc>
-          <w:tcPr>
-            <w:tcW w:type="dxa" w:w="1361"/>
-          </w:tcPr>
-          <w:p>
-            <w:pPr>
-              <w:spacing w:after="0" w:line="240" w:lineRule="auto"/>
-            </w:pPr>
-            <w:r/>
-            <w:r>
-              <w:rPr>
-                <w:b w:val="0"/>
-                <w:sz w:val="17"/>
-              </w:rPr>
-              <w:t>ウズベキスタン</w:t>
-            </w:r>
-          </w:p>
-        </w:tc>
-        <w:tc>
-          <w:tcPr>
-            <w:tcW w:type="dxa" w:w="3742"/>
-          </w:tcPr>
-          <w:p>
-            <w:pPr>
-              <w:spacing w:after="0" w:line="240" w:lineRule="auto"/>
-            </w:pPr>
-            <w:r/>
-            <w:r>
-              <w:rPr>
-                <w:b w:val="0"/>
-                <w:sz w:val="17"/>
-              </w:rPr>
-              <w:t>登壇者の指名</w:t>
-            </w:r>
-          </w:p>
-        </w:tc>
-        <w:tc>
-          <w:tcPr>
-            <w:tcW w:type="dxa" w:w="2041"/>
-          </w:tcPr>
-          <w:p>
-            <w:pPr>
-              <w:spacing w:after="0" w:line="240" w:lineRule="auto"/>
-            </w:pPr>
-            <w:r/>
-            <w:r>
-              <w:rPr>
-                <w:b w:val="0"/>
-                <w:sz w:val="17"/>
-              </w:rPr>
-              <w:t>9/16〜無反応（公式窓口は 9/1〜）</w:t>
-            </w:r>
-          </w:p>
-        </w:tc>
-        <w:tc>
-          <w:tcPr>
-            <w:tcW w:type="dxa" w:w="2721"/>
-          </w:tcPr>
-          <w:p>
-            <w:pPr>
-              <w:spacing w:after="0" w:line="240" w:lineRule="auto"/>
-            </w:pPr>
-            <w:r/>
-            <w:r>
-              <w:rPr>
-                <w:b w:val="0"/>
-                <w:sz w:val="17"/>
-              </w:rPr>
-              <w:t>上記 G</w:t>
+              <w:t>上記 B。ビザ申請開始 9/26</w:t>
             </w:r>
           </w:p>
         </w:tc>
@@ -3240,7 +3131,7 @@
                 <w:b w:val="0"/>
                 <w:sz w:val="17"/>
               </w:rPr>
-              <w:t>書面での受諾は済み。質疑時間の訂正が未</w:t>
+              <w:t>質疑時間の一行訂正（約30分 → 質疑とまとめで約25分、当日調整）</w:t>
             </w:r>
           </w:p>
         </w:tc>
@@ -3258,7 +3149,7 @@
                 <w:b w:val="0"/>
                 <w:sz w:val="17"/>
               </w:rPr>
-              <w:t>—</w:t>
+              <w:t>池田了承 9/24</w:t>
             </w:r>
           </w:p>
         </w:tc>
@@ -3276,7 +3167,7 @@
                 <w:b w:val="0"/>
                 <w:sz w:val="17"/>
               </w:rPr>
-              <w:t>C の判断後</w:t>
+              <w:t>荒木田から次の連絡で</w:t>
             </w:r>
           </w:p>
         </w:tc>
@@ -3370,6 +3261,154 @@
                 <w:b w:val="0"/>
                 <w:sz w:val="17"/>
               </w:rPr>
+              <w:t>タイ DDPM</w:t>
+            </w:r>
+          </w:p>
+        </w:tc>
+        <w:tc>
+          <w:tcPr>
+            <w:tcW w:type="dxa" w:w="3742"/>
+          </w:tcPr>
+          <w:p>
+            <w:pPr>
+              <w:spacing w:after="0" w:line="240" w:lineRule="auto"/>
+            </w:pPr>
+            <w:r/>
+            <w:r>
+              <w:rPr>
+                <w:b w:val="0"/>
+                <w:sz w:val="17"/>
+              </w:rPr>
+              <w:t>Prasong 氏の正式登録</w:t>
+            </w:r>
+          </w:p>
+        </w:tc>
+        <w:tc>
+          <w:tcPr>
+            <w:tcW w:type="dxa" w:w="2041"/>
+          </w:tcPr>
+          <w:p>
+            <w:pPr>
+              <w:spacing w:after="0" w:line="240" w:lineRule="auto"/>
+            </w:pPr>
+            <w:r/>
+            <w:r>
+              <w:rPr>
+                <w:b w:val="0"/>
+                <w:sz w:val="17"/>
+              </w:rPr>
+              <w:t>9/22 指名予定の連絡</w:t>
+            </w:r>
+          </w:p>
+        </w:tc>
+        <w:tc>
+          <w:tcPr>
+            <w:tcW w:type="dxa" w:w="2721"/>
+          </w:tcPr>
+          <w:p>
+            <w:pPr>
+              <w:spacing w:after="0" w:line="240" w:lineRule="auto"/>
+            </w:pPr>
+            <w:r/>
+            <w:r>
+              <w:rPr>
+                <w:b w:val="0"/>
+                <w:sz w:val="17"/>
+              </w:rPr>
+              <w:t>登録フォームへの入力を待つ</w:t>
+            </w:r>
+          </w:p>
+        </w:tc>
+      </w:tr>
+      <w:tr>
+        <w:tc>
+          <w:tcPr>
+            <w:tcW w:type="dxa" w:w="1361"/>
+          </w:tcPr>
+          <w:p>
+            <w:pPr>
+              <w:spacing w:after="0" w:line="240" w:lineRule="auto"/>
+            </w:pPr>
+            <w:r/>
+            <w:r>
+              <w:rPr>
+                <w:b w:val="0"/>
+                <w:sz w:val="17"/>
+              </w:rPr>
+              <w:t>インド</w:t>
+            </w:r>
+          </w:p>
+        </w:tc>
+        <w:tc>
+          <w:tcPr>
+            <w:tcW w:type="dxa" w:w="3742"/>
+          </w:tcPr>
+          <w:p>
+            <w:pPr>
+              <w:spacing w:after="0" w:line="240" w:lineRule="auto"/>
+            </w:pPr>
+            <w:r/>
+            <w:r>
+              <w:rPr>
+                <w:b w:val="0"/>
+                <w:sz w:val="17"/>
+              </w:rPr>
+              <w:t>最終承認と旅券</w:t>
+            </w:r>
+          </w:p>
+        </w:tc>
+        <w:tc>
+          <w:tcPr>
+            <w:tcW w:type="dxa" w:w="2041"/>
+          </w:tcPr>
+          <w:p>
+            <w:pPr>
+              <w:spacing w:after="0" w:line="240" w:lineRule="auto"/>
+            </w:pPr>
+            <w:r/>
+            <w:r>
+              <w:rPr>
+                <w:b w:val="0"/>
+                <w:sz w:val="17"/>
+              </w:rPr>
+              <w:t>9/17〜</w:t>
+            </w:r>
+          </w:p>
+        </w:tc>
+        <w:tc>
+          <w:tcPr>
+            <w:tcW w:type="dxa" w:w="2721"/>
+          </w:tcPr>
+          <w:p>
+            <w:pPr>
+              <w:spacing w:after="0" w:line="240" w:lineRule="auto"/>
+            </w:pPr>
+            <w:r/>
+            <w:r>
+              <w:rPr>
+                <w:b w:val="0"/>
+                <w:sz w:val="17"/>
+              </w:rPr>
+              <w:t>旅券到着後に発券</w:t>
+            </w:r>
+          </w:p>
+        </w:tc>
+      </w:tr>
+      <w:tr>
+        <w:tc>
+          <w:tcPr>
+            <w:tcW w:type="dxa" w:w="1361"/>
+          </w:tcPr>
+          <w:p>
+            <w:pPr>
+              <w:spacing w:after="0" w:line="240" w:lineRule="auto"/>
+            </w:pPr>
+            <w:r/>
+            <w:r>
+              <w:rPr>
+                <w:b w:val="0"/>
+                <w:sz w:val="17"/>
+              </w:rPr>
               <w:t>内閣府</w:t>
             </w:r>
           </w:p>
@@ -3388,7 +3427,7 @@
                 <w:b w:val="0"/>
                 <w:sz w:val="17"/>
               </w:rPr>
-              <w:t>CaO 登壇者</w:t>
+              <w:t>CaO 登壇者、日本パビリオンの所要時間</w:t>
             </w:r>
           </w:p>
         </w:tc>
@@ -3449,7 +3488,7 @@
           <w:color w:val="1F3864"/>
           <w:sz w:val="24"/>
         </w:rPr>
-        <w:t>5. 下書き（未送信）の整理</w:t>
+        <w:t>5. 発信済みと残る発信</w:t>
       </w:r>
     </w:p>
     <w:tbl>
@@ -3543,7 +3582,7 @@
                 <w:color w:val="FFFFFF"/>
                 <w:sz w:val="17"/>
               </w:rPr>
-              <w:t>提案</w:t>
+              <w:t>残る発信</w:t>
             </w:r>
           </w:p>
         </w:tc>
@@ -3581,7 +3620,7 @@
                 <w:b w:val="0"/>
                 <w:sz w:val="17"/>
               </w:rPr>
-              <w:t>基本床の受入＋機材リスト＋9/22 回答への返答（統合版、9/24 08:07）</w:t>
+              <w:t>座席案（U28）＋機材リスト＋9/22 回答への返答、スケッチ添付</w:t>
             </w:r>
           </w:p>
         </w:tc>
@@ -3599,7 +3638,7 @@
                 <w:b w:val="0"/>
                 <w:sz w:val="17"/>
               </w:rPr>
-              <w:t>未送信</w:t>
+              <w:t>9/24 09:43 送信済み</w:t>
             </w:r>
           </w:p>
         </w:tc>
@@ -3617,7 +3656,7 @@
                 <w:b w:val="0"/>
                 <w:sz w:val="17"/>
               </w:rPr>
-              <w:t>送信。同スレッドに残る 9/18 版と 9/24 08:03 版の2本は重複のため削除</w:t>
+              <w:t>SG 側署名者の照会、Sirada 氏訂正は別途</w:t>
             </w:r>
           </w:p>
         </w:tc>
@@ -3655,7 +3694,7 @@
                 <w:b w:val="0"/>
                 <w:sz w:val="17"/>
               </w:rPr>
-              <w:t>招待状 v2 の送付と質疑時間・rev 1.0 追記の確認</w:t>
+              <w:t>招待状 v2 の送付と質疑時間・CN 追記の確認</w:t>
             </w:r>
           </w:p>
         </w:tc>
@@ -3673,7 +3712,7 @@
                 <w:b w:val="0"/>
                 <w:sz w:val="17"/>
               </w:rPr>
-              <w:t>下書きなし（9/18 作成分は消失。v2 は池田に未送付）</w:t>
+              <w:t>9/24 08:56 送信、10:00 池田回答、10:34 返信済み</w:t>
             </w:r>
           </w:p>
         </w:tc>
@@ -3691,7 +3730,7 @@
                 <w:b w:val="0"/>
                 <w:sz w:val="17"/>
               </w:rPr>
-              <w:t>短い版を作り直して 9/24 中に送る</w:t>
+              <w:t>なし。藤本にも最新レター（v2）を転送済み（12:51）</w:t>
             </w:r>
           </w:p>
         </w:tc>
@@ -3729,7 +3768,7 @@
                 <w:b w:val="0"/>
                 <w:sz w:val="17"/>
               </w:rPr>
-              <w:t>COSEM ビザ手順の Letter of undertaking（COSEM 作成・本人署名）の共有</w:t>
+              <w:t>ウズベキスタンのビザ要への返信</w:t>
             </w:r>
           </w:p>
         </w:tc>
@@ -3747,7 +3786,7 @@
                 <w:b w:val="0"/>
                 <w:sz w:val="17"/>
               </w:rPr>
-              <w:t>未送信</w:t>
+              <w:t>9/24 08:58 送信済み</w:t>
             </w:r>
           </w:p>
         </w:tc>
@@ -3765,7 +3804,81 @@
                 <w:b w:val="0"/>
                 <w:sz w:val="17"/>
               </w:rPr>
-              <w:t>一行で共有</w:t>
+              <w:t>COSEM 手順の Letter of undertaking（COSEM 作成・本人署名）は未共有。一行で共有</w:t>
+            </w:r>
+          </w:p>
+        </w:tc>
+      </w:tr>
+      <w:tr>
+        <w:tc>
+          <w:tcPr>
+            <w:tcW w:type="dxa" w:w="1814"/>
+          </w:tcPr>
+          <w:p>
+            <w:pPr>
+              <w:spacing w:after="0" w:line="240" w:lineRule="auto"/>
+            </w:pPr>
+            <w:r/>
+            <w:r>
+              <w:rPr>
+                <w:b w:val="0"/>
+                <w:sz w:val="17"/>
+              </w:rPr>
+              <w:t>Sylvia（WhatsApp）</w:t>
+            </w:r>
+          </w:p>
+        </w:tc>
+        <w:tc>
+          <w:tcPr>
+            <w:tcW w:type="dxa" w:w="3628"/>
+          </w:tcPr>
+          <w:p>
+            <w:pPr>
+              <w:spacing w:after="0" w:line="240" w:lineRule="auto"/>
+            </w:pPr>
+            <w:r/>
+            <w:r>
+              <w:rPr>
+                <w:b w:val="0"/>
+                <w:sz w:val="17"/>
+              </w:rPr>
+              <w:t>名札・マイクの範囲、バナー修正依頼</w:t>
+            </w:r>
+          </w:p>
+        </w:tc>
+        <w:tc>
+          <w:tcPr>
+            <w:tcW w:type="dxa" w:w="1928"/>
+          </w:tcPr>
+          <w:p>
+            <w:pPr>
+              <w:spacing w:after="0" w:line="240" w:lineRule="auto"/>
+            </w:pPr>
+            <w:r/>
+            <w:r>
+              <w:rPr>
+                <w:b w:val="0"/>
+                <w:sz w:val="17"/>
+              </w:rPr>
+              <w:t>9/24 返信済み</w:t>
+            </w:r>
+          </w:p>
+        </w:tc>
+        <w:tc>
+          <w:tcPr>
+            <w:tcW w:type="dxa" w:w="2494"/>
+          </w:tcPr>
+          <w:p>
+            <w:pPr>
+              <w:spacing w:after="0" w:line="240" w:lineRule="auto"/>
+            </w:pPr>
+            <w:r/>
+            <w:r>
+              <w:rPr>
+                <w:b w:val="0"/>
+                <w:sz w:val="17"/>
+              </w:rPr>
+              <w:t>なし</w:t>
             </w:r>
           </w:p>
         </w:tc>
@@ -3814,7 +3927,7 @@
         <w:rPr>
           <w:sz w:val="19"/>
         </w:rPr>
-        <w:t>・SJ60 記念レセプション（10/27）: シンガポール GOH への招待は大使館から MHA へ（9/16 送付済み、次官級を想定）。Comr の登場は乾杯または写真撮影時の紹介（安達氏・中根氏 9/15）。</w:t>
+        <w:t>・日本パビリオン開会式（GOH ツアー内）の所要時間の希望。これにより Day 1 全体の前倒し可否を判断し、COSEM へ回答する。</w:t>
       </w:r>
     </w:p>
     <w:p>
@@ -3826,7 +3939,7 @@
         <w:rPr>
           <w:sz w:val="19"/>
         </w:rPr>
-        <w:t>・ガラディナー（10/28）での日本政府代表挨拶は COSEM 側で枠を設けられないとの回答（Leow 氏 9/15）。内閣府へは 9/15 に児玉から通知済み。</w:t>
+        <w:t>・SJ60 記念レセプション（10/27）: シンガポール GOH への招待は大使館から MHA へ（9/16 送付済み）。Comr の登場は乾杯または写真撮影時の紹介。名簿は 9/27 頃提出。</w:t>
       </w:r>
     </w:p>
     <w:p>
@@ -3838,7 +3951,7 @@
         <w:rPr>
           <w:sz w:val="19"/>
         </w:rPr>
-        <w:t>・SC 用 ADRC 活動報告案は研究部の修正を反映済み（池田・Mizan・荒木田）。</w:t>
+        <w:t>・ガラディナー（10/28）での日本政府代表挨拶は COSEM 側で枠を設けられない（Leow 氏 9/15、内閣府へ通知済み）。</w:t>
       </w:r>
     </w:p>
     <w:p>
@@ -3850,7 +3963,19 @@
         <w:rPr>
           <w:sz w:val="19"/>
         </w:rPr>
-        <w:t>・仙台市副市長（次期 APMCDRR ホスト）の随行者の扱い（speaker 枠か main list 枠か。Sylvia 氏持ち帰り中）。</w:t>
+        <w:t>・SC 用 ADRC 活動報告案は研究部の修正を反映済み（9/25 午前締切）。</w:t>
+      </w:r>
+    </w:p>
+    <w:p>
+      <w:pPr>
+        <w:spacing w:after="40"/>
+        <w:ind w:left="283" w:hanging="227"/>
+      </w:pPr>
+      <w:r>
+        <w:rPr>
+          <w:sz w:val="19"/>
+        </w:rPr>
+        <w:t>・仙台市副市長（次期 APMCDRR ホスト）の随行者の扱い（Sylvia 氏持ち帰り中）。</w:t>
       </w:r>
     </w:p>
     <w:p>

</xml_diff>

<commit_message>
Assign SC admin to Fujinaka and record the Uzbekistan contact
</commit_message>
<xml_diff>
--- a/reports/acdr2026_staff_deployment/ACDR2026_所内打合せ資料_最新状況と要判断事項_0924.docx
+++ b/reports/acdr2026_staff_deployment/ACDR2026_所内打合せ資料_最新状況と要判断事項_0924.docx
@@ -27,7 +27,7 @@
           <w:color w:val="595959"/>
           <w:sz w:val="21"/>
         </w:rPr>
-        <w:t>最新状況と要判断事項（2026年9月24日 14:00 JST 時点・更新版）</w:t>
+        <w:t>最新状況と要判断事項（2026年9月24日 17:00 JST 時点・更新版）</w:t>
       </w:r>
     </w:p>
     <w:p>
@@ -68,7 +68,7 @@
           <w:i w:val="0"/>
           <w:sz w:val="19"/>
         </w:rPr>
-        <w:t>9/24 午前で三つ動いた。(1) テクニカルセッションの文書一式は池田と合意した（質疑15分＋まとめ10分、招待状 v2 に追加コメントなし、コンセプトノート rev 1.2）。残るのはシンガポール側の署名者だけで、署名後は池田が各登壇者へ発送する。(2) 会場は U 字28席案と機材リストを Sylvia 氏へ送付済み。名札・マイクの範囲、バナーの修正依頼も WhatsApp で回答済み。(3) タジキスタン・ウズベキスタンへ WhatsApp で再リマインドした。残る大物は、ウズベキスタン枠の代替判断、AV 費用の上限、Day 1 前倒し（日本パビリオンの所要時間次第）、内閣府枠（9/25）の4つ。</w:t>
+        <w:t>9/24 午前で三つ動いた。(1) テクニカルセッションの文書一式は池田と合意した（質疑15分＋まとめ10分、招待状 v2 に追加コメントなし、コンセプトノート rev 1.2）。残るのはシンガポール側の署名者だけで、署名後は池田が各登壇者へ発送する。(2) 会場は U 字28席案と機材リストを Sylvia 氏へ送付済み。名札・マイクの範囲、バナーの修正依頼も WhatsApp で回答済み。(3) ウズベキスタンと連絡が取れ、2名を選出・登録する予定と確認できた（事務局が案内メールを再送）。残る大物は、AV 費用の上限、Day 1 前倒し（日本パビリオンの所要時間次第）、内閣府枠（9/25）、招待状の COSEM 署名の4つ。</w:t>
       </w:r>
     </w:p>
     <w:p>
@@ -2054,7 +2054,7 @@
                 <w:b w:val="0"/>
                 <w:sz w:val="17"/>
               </w:rPr>
-              <w:t>9/16 の個人アドレスへの再照会に無反応。9/24 に WhatsApp で再リマインド（タジキスタンと併せて）。代替候補なし。ビザ要（申請 9/26〜、3営業日）。10/2 締切。</w:t>
+              <w:t>9/24 の WhatsApp 再リマインドで連絡が取れ、2名を選出して登録する予定と確認。事務局から分かりやすい案内メールを再送するよう依頼済み。ビザ要（申請 9/26〜、3営業日）。TS 提出物は 10/2 締切。</w:t>
             </w:r>
           </w:p>
         </w:tc>
@@ -2072,7 +2072,7 @@
                 <w:b w:val="0"/>
                 <w:sz w:val="17"/>
               </w:rPr>
-              <w:t>今週中に回答がなければ代替（中央アジア他国の JICA 研修修了生、または ADRC 内部）へ切替。CN の「Central Asia and Caucasus」は代替でも使える。</w:t>
+              <w:t>登録が届き次第、田中にビザ書類（Form 14A・写真・旅券写し）を依頼し、池田へ登壇者名を連絡。10/2 に間に合わなければ提出期限だけ個別延長。</w:t>
             </w:r>
           </w:p>
         </w:tc>
@@ -2090,7 +2090,7 @@
                 <w:b w:val="0"/>
                 <w:sz w:val="17"/>
               </w:rPr>
-              <w:t>荒木田</w:t>
+              <w:t>荒木田・田中・池田</w:t>
             </w:r>
           </w:p>
         </w:tc>
@@ -2404,7 +2404,7 @@
                 <w:b w:val="0"/>
                 <w:sz w:val="17"/>
               </w:rPr>
-              <w:t>招待状の SG 側署名者</w:t>
+              <w:t>招待状の COSEM 署名</w:t>
             </w:r>
           </w:p>
         </w:tc>
@@ -2422,7 +2422,7 @@
                 <w:b w:val="0"/>
                 <w:sz w:val="17"/>
               </w:rPr>
-              <w:t>池田は署名後に発送する前提。SG 側が誰の名で署名するか未確認。</w:t>
+              <w:t>田中の提案で、メンバー国レターと同じ COSEM 側の書式に改めることで合意（9/24 15:21）。三浦会長の署名後に田中が COSEM へ署名依頼。池田: 急ぎは BRIN と YI-Lab、Mizan がレターヘッド確認中。</w:t>
             </w:r>
           </w:p>
         </w:tc>
@@ -2440,7 +2440,7 @@
                 <w:b w:val="0"/>
                 <w:sz w:val="17"/>
               </w:rPr>
-              <w:t>Sylvia 氏に照会（次のメールで）。SCDF 幹部か COSEM Leow 氏か。電子署名で可か。</w:t>
+              <w:t>書式変更は田中、会長署名は池田が並行して準備。COSEM 側の署名者名は田中経由で確認。</w:t>
             </w:r>
           </w:p>
         </w:tc>
@@ -2458,7 +2458,7 @@
                 <w:b w:val="0"/>
                 <w:sz w:val="17"/>
               </w:rPr>
-              <w:t>荒木田</w:t>
+              <w:t>田中・池田</w:t>
             </w:r>
           </w:p>
         </w:tc>
@@ -3039,7 +3039,7 @@
                 <w:b w:val="0"/>
                 <w:sz w:val="17"/>
               </w:rPr>
-              <w:t>ウズベキスタン・タジキスタン</w:t>
+              <w:t>ウズベキスタン</w:t>
             </w:r>
           </w:p>
         </w:tc>
@@ -3057,7 +3057,81 @@
                 <w:b w:val="0"/>
                 <w:sz w:val="17"/>
               </w:rPr>
-              <w:t>登壇者の指名（ウズベク）、参加登録</w:t>
+              <w:t>2名の選出と登録</w:t>
+            </w:r>
+          </w:p>
+        </w:tc>
+        <w:tc>
+          <w:tcPr>
+            <w:tcW w:type="dxa" w:w="2041"/>
+          </w:tcPr>
+          <w:p>
+            <w:pPr>
+              <w:spacing w:after="0" w:line="240" w:lineRule="auto"/>
+            </w:pPr>
+            <w:r/>
+            <w:r>
+              <w:rPr>
+                <w:b w:val="0"/>
+                <w:sz w:val="17"/>
+              </w:rPr>
+              <w:t>9/24 連絡が取れた。事務局が案内メールを再送</w:t>
+            </w:r>
+          </w:p>
+        </w:tc>
+        <w:tc>
+          <w:tcPr>
+            <w:tcW w:type="dxa" w:w="2721"/>
+          </w:tcPr>
+          <w:p>
+            <w:pPr>
+              <w:spacing w:after="0" w:line="240" w:lineRule="auto"/>
+            </w:pPr>
+            <w:r/>
+            <w:r>
+              <w:rPr>
+                <w:b w:val="0"/>
+                <w:sz w:val="17"/>
+              </w:rPr>
+              <w:t>登録後にビザ書類と登壇者名</w:t>
+            </w:r>
+          </w:p>
+        </w:tc>
+      </w:tr>
+      <w:tr>
+        <w:tc>
+          <w:tcPr>
+            <w:tcW w:type="dxa" w:w="1361"/>
+          </w:tcPr>
+          <w:p>
+            <w:pPr>
+              <w:spacing w:after="0" w:line="240" w:lineRule="auto"/>
+            </w:pPr>
+            <w:r/>
+            <w:r>
+              <w:rPr>
+                <w:b w:val="0"/>
+                <w:sz w:val="17"/>
+              </w:rPr>
+              <w:t>タジキスタン</w:t>
+            </w:r>
+          </w:p>
+        </w:tc>
+        <w:tc>
+          <w:tcPr>
+            <w:tcW w:type="dxa" w:w="3742"/>
+          </w:tcPr>
+          <w:p>
+            <w:pPr>
+              <w:spacing w:after="0" w:line="240" w:lineRule="auto"/>
+            </w:pPr>
+            <w:r/>
+            <w:r>
+              <w:rPr>
+                <w:b w:val="0"/>
+                <w:sz w:val="17"/>
+              </w:rPr>
+              <w:t>参加登録</w:t>
             </w:r>
           </w:p>
         </w:tc>
@@ -3093,7 +3167,7 @@
                 <w:b w:val="0"/>
                 <w:sz w:val="17"/>
               </w:rPr>
-              <w:t>上記 B。ビザ申請開始 9/26</w:t>
+              <w:t>回答待ち。ビザ要</w:t>
             </w:r>
           </w:p>
         </w:tc>
@@ -3656,7 +3730,81 @@
                 <w:b w:val="0"/>
                 <w:sz w:val="17"/>
               </w:rPr>
-              <w:t>SG 側署名者の照会、Sirada 氏訂正は別途</w:t>
+              <w:t>Sirada 氏訂正は別途</w:t>
+            </w:r>
+          </w:p>
+        </w:tc>
+      </w:tr>
+      <w:tr>
+        <w:tc>
+          <w:tcPr>
+            <w:tcW w:type="dxa" w:w="1814"/>
+          </w:tcPr>
+          <w:p>
+            <w:pPr>
+              <w:spacing w:after="0" w:line="240" w:lineRule="auto"/>
+            </w:pPr>
+            <w:r/>
+            <w:r>
+              <w:rPr>
+                <w:b w:val="0"/>
+                <w:sz w:val="17"/>
+              </w:rPr>
+              <w:t>Sylvia（バナー）</w:t>
+            </w:r>
+          </w:p>
+        </w:tc>
+        <w:tc>
+          <w:tcPr>
+            <w:tcW w:type="dxa" w:w="3628"/>
+          </w:tcPr>
+          <w:p>
+            <w:pPr>
+              <w:spacing w:after="0" w:line="240" w:lineRule="auto"/>
+            </w:pPr>
+            <w:r/>
+            <w:r>
+              <w:rPr>
+                <w:b w:val="0"/>
+                <w:sz w:val="17"/>
+              </w:rPr>
+              <w:t>修正版デザインの承認、ソフトコピー投影と物理バナーの併用に同意</w:t>
+            </w:r>
+          </w:p>
+        </w:tc>
+        <w:tc>
+          <w:tcPr>
+            <w:tcW w:type="dxa" w:w="1928"/>
+          </w:tcPr>
+          <w:p>
+            <w:pPr>
+              <w:spacing w:after="0" w:line="240" w:lineRule="auto"/>
+            </w:pPr>
+            <w:r/>
+            <w:r>
+              <w:rPr>
+                <w:b w:val="0"/>
+                <w:sz w:val="17"/>
+              </w:rPr>
+              <w:t>下書き作成済み（未送信）</w:t>
+            </w:r>
+          </w:p>
+        </w:tc>
+        <w:tc>
+          <w:tcPr>
+            <w:tcW w:type="dxa" w:w="2494"/>
+          </w:tcPr>
+          <w:p>
+            <w:pPr>
+              <w:spacing w:after="0" w:line="240" w:lineRule="auto"/>
+            </w:pPr>
+            <w:r/>
+            <w:r>
+              <w:rPr>
+                <w:b w:val="0"/>
+                <w:sz w:val="17"/>
+              </w:rPr>
+              <w:t>送信</w:t>
             </w:r>
           </w:p>
         </w:tc>
@@ -3963,7 +4111,7 @@
         <w:rPr>
           <w:sz w:val="19"/>
         </w:rPr>
-        <w:t>・SC 用 ADRC 活動報告案は研究部の修正を反映済み（9/25 午前締切）。</w:t>
+        <w:t>・SC 用 ADRC 活動報告案は研究部の修正を反映済み（9/25 午前締切）。SC 事務（議案・進行・会計報告）は藤中。</w:t>
       </w:r>
     </w:p>
     <w:p>

</xml_diff>